<commit_message>
Align the docs for judging: Mike Rose only, five-minute path, evaluation
- docs/demo: one sample candidate (Mike Rose); the Jordan Lee resume is
  gone, the job description now fits Mike, and demo-scenarios.md is a
  judges' guide instead of presenter notes.
- README: live app and demo video links, a five-minute path, an
  evaluation section from measured numbers in the ADRs, a Mermaid
  architecture diagram, the daily limit, and a note that the code was
  written with Claude Code. Drops the pointer to open issues.
- BRIEF.md: a note on where the build changed course; model lines match
  the build.
- CLAUDE.md: stale Phase 0 gotchas replaced; limits, upload size, demo kit.
- firebase-auth.json: support email is anyview@anyapps.cloud.

Co-Authored-By: Claude Opus 5.5 <noreply@anthropic.com>
Claude-Session: https://claude.ai/code/session_01NmpjJUvzKhwrP94NDLefah
</commit_message>
<xml_diff>
--- a/docs/demo/job-description.docx
+++ b/docs/demo/job-description.docx
@@ -7,12 +7,12 @@
         <w:pStyle w:val="Title"/>
       </w:pPr>
       <w:r>
-        <w:t>Staff Platform Engineer — Cloud Infrastructure</w:t>
+        <w:t>Senior Cloud Solutions Architect — Multi-Cloud</w:t>
       </w:r>
     </w:p>
     <w:p>
       <w:r>
-        <w:t>Northstar Wallet · Singapore (hybrid) · Full time</w:t>
+        <w:t>Northstar Cloud Partners · Singapore (hybrid) · Full time</w:t>
       </w:r>
     </w:p>
     <w:p>
@@ -33,7 +33,7 @@
     </w:p>
     <w:p>
       <w:r>
-        <w:t>Northstar Wallet runs a consumer payments app used by 6 million people across Southeast Asia. The Platform team of eight builds the cloud foundation that 20 product teams ship on: Kubernetes clusters, infrastructure as code, CI/CD and observability.</w:t>
+        <w:t>Northstar Cloud Partners is a cloud consultancy serving banks, insurers and public-sector agencies across Southeast Asia. Our Architecture practice of twelve designs and delivers secure landing zones, platform modernisation and AI-assisted operations on AWS, Google Cloud and Microsoft Azure, and stays with each customer from the first workshop to run-state support.</w:t>
       </w:r>
     </w:p>
     <w:p>
@@ -45,51 +45,38 @@
       </w:r>
     </w:p>
     <w:p>
-      <w:pPr>
-        <w:ind w:left="280" w:hanging="200"/>
-      </w:pPr>
       <w:r>
-        <w:t>• Lead the design of our next-generation platform on Google Cloud, from network to developer experience.</w:t>
+        <w:t>• Lead discovery with customer stakeholders, turn their requirements into a scope of work, and produce effort estimates that hold up in delivery.</w:t>
       </w:r>
     </w:p>
     <w:p>
-      <w:pPr>
-        <w:ind w:left="280" w:hanging="200"/>
-      </w:pPr>
       <w:r>
-        <w:t>• Own platform reliability: set SLOs, lead incident response and run blameless postmortems.</w:t>
+        <w:t>• Design multi-cloud architectures (landing zones, networking, identity and security controls) that meet regulatory and compliance requirements.</w:t>
       </w:r>
     </w:p>
     <w:p>
-      <w:pPr>
-        <w:ind w:left="280" w:hanging="200"/>
-      </w:pPr>
       <w:r>
-        <w:t>• Build self-service golden paths so product teams can ship a new service without a ticket.</w:t>
+        <w:t>• Lead delivery hands-on: write and review Terraform, set up keyless CI/CD, and troubleshoot what other teams cannot.</w:t>
       </w:r>
     </w:p>
     <w:p>
-      <w:pPr>
-        <w:ind w:left="280" w:hanging="200"/>
-      </w:pPr>
       <w:r>
-        <w:t>• Bring down cloud spend without slowing teams down.</w:t>
+        <w:t>• Shape new business: run assessments, contribute to RFP responses and present solutions to customer leadership.</w:t>
       </w:r>
     </w:p>
     <w:p>
-      <w:pPr>
-        <w:ind w:left="280" w:hanging="200"/>
-      </w:pPr>
       <w:r>
-        <w:t>• Mentor engineers and help grow the Platform team from eight to twelve.</w:t>
+        <w:t>• Build reusable assets for the practice: reference architectures, golden templates and assessment frameworks.</w:t>
       </w:r>
     </w:p>
     <w:p>
-      <w:pPr>
-        <w:ind w:left="280" w:hanging="200"/>
-      </w:pPr>
       <w:r>
-        <w:t>• Work with Security, Risk and Compliance to keep us inside payments regulation while still shipping weekly.</w:t>
+        <w:t>• Bring generative AI into our offerings responsibly, from retrieval-augmented assistants to automated compliance checks.</w:t>
+      </w:r>
+    </w:p>
+    <w:p>
+      <w:r>
+        <w:t>• Mentor consultants and help grow the practice.</w:t>
       </w:r>
     </w:p>
     <w:p>
@@ -101,43 +88,33 @@
       </w:r>
     </w:p>
     <w:p>
-      <w:pPr>
-        <w:ind w:left="280" w:hanging="200"/>
-      </w:pPr>
       <w:r>
-        <w:t>• 7+ years in platform, SRE or DevOps roles, with production ownership of a regulated or high-traffic system.</w:t>
+        <w:t>• 5+ years in cloud architecture or infrastructure consulting, with customer-facing ownership of engagements end to end.</w:t>
       </w:r>
     </w:p>
     <w:p>
-      <w:pPr>
-        <w:ind w:left="280" w:hanging="200"/>
-      </w:pPr>
       <w:r>
-        <w:t>• Deep, hands-on Kubernetes and Terraform.</w:t>
+        <w:t>• Deep, hands-on experience on AWS and at least one of Google Cloud or Microsoft Azure.</w:t>
       </w:r>
     </w:p>
     <w:p>
-      <w:pPr>
-        <w:ind w:left="280" w:hanging="200"/>
-      </w:pPr>
       <w:r>
-        <w:t>• Experience leading a large migration to the cloud.</w:t>
+        <w:t>• Infrastructure as code with Terraform, and CI/CD without long-lived credentials.</w:t>
       </w:r>
     </w:p>
     <w:p>
-      <w:pPr>
-        <w:ind w:left="280" w:hanging="200"/>
-      </w:pPr>
       <w:r>
-        <w:t>• Clear writing and the ability to push back on a deadline with data rather than opinion.</w:t>
+        <w:t>• Experience in regulated or public-sector environments (for example IM8, MAS TRM or CIS Benchmarks).</w:t>
       </w:r>
     </w:p>
     <w:p>
-      <w:pPr>
-        <w:ind w:left="280" w:hanging="200"/>
-      </w:pPr>
       <w:r>
-        <w:t>• Experience hiring and mentoring engineers.</w:t>
+        <w:t>• Clear communication with both engineers and executives, including pushing back on scope or deadlines with evidence.</w:t>
+      </w:r>
+    </w:p>
+    <w:p>
+      <w:r>
+        <w:t>• Experience mentoring or leading engineers.</w:t>
       </w:r>
     </w:p>
     <w:p>
@@ -149,32 +126,28 @@
       </w:r>
     </w:p>
     <w:p>
-      <w:pPr>
-        <w:ind w:left="280" w:hanging="200"/>
-      </w:pPr>
       <w:r>
-        <w:t>• Payments or fintech background.</w:t>
+        <w:t>• AWS Certified Solutions Architect – Professional, or Google Cloud Professional Cloud Architect.</w:t>
       </w:r>
     </w:p>
     <w:p>
-      <w:pPr>
-        <w:ind w:left="280" w:hanging="200"/>
-      </w:pPr>
       <w:r>
-        <w:t>• Google Cloud Professional Cloud Architect or CKA certification.</w:t>
+        <w:t>• Kubernetes in production (Amazon EKS or GKE).</w:t>
       </w:r>
     </w:p>
     <w:p>
-      <w:pPr>
-        <w:ind w:left="280" w:hanging="200"/>
-      </w:pPr>
       <w:r>
-        <w:t>• Experience with streaming systems.</w:t>
+        <w:t>• Hands-on generative AI on a cloud platform (Amazon Bedrock or Gemini Enterprise Agent Platform).</w:t>
+      </w:r>
+    </w:p>
+    <w:p>
+      <w:r>
+        <w:t>• FinOps or cloud cost optimisation experience.</w:t>
       </w:r>
     </w:p>
     <w:sectPr>
       <w:pgSz w:w="12240" w:h="15840"/>
-      <w:pgMar w:top="840" w:right="1080" w:bottom="840" w:left="1080" w:header="720" w:footer="720" w:gutter="0"/>
+      <w:pgMar w:top="1440" w:right="1800" w:bottom="1440" w:left="1800" w:header="720" w:footer="720" w:gutter="0"/>
       <w:cols w:space="720"/>
       <w:docGrid w:linePitch="360"/>
     </w:sectPr>
@@ -545,13 +518,6 @@
     <w:name w:val="Normal"/>
     <w:qFormat/>
     <w:rsid w:val="00FC693F"/>
-    <w:pPr>
-      <w:spacing w:after="60"/>
-    </w:pPr>
-    <w:rPr>
-      <w:rFonts w:ascii="Calibri" w:hAnsi="Calibri"/>
-      <w:sz w:val="20"/>
-    </w:rPr>
   </w:style>
   <w:style w:type="paragraph" w:styleId="Header">
     <w:name w:val="header"/>
@@ -608,7 +574,7 @@
     <w:pPr>
       <w:keepNext/>
       <w:keepLines/>
-      <w:spacing w:before="160" w:after="40"/>
+      <w:spacing w:before="480" w:after="0"/>
       <w:outlineLvl w:val="0"/>
     </w:pPr>
     <w:rPr>
@@ -632,7 +598,7 @@
     <w:pPr>
       <w:keepNext/>
       <w:keepLines/>
-      <w:spacing w:before="160" w:after="40"/>
+      <w:spacing w:before="200" w:after="0"/>
       <w:outlineLvl w:val="1"/>
     </w:pPr>
     <w:rPr>

</xml_diff>